<commit_message>
fix(poster): 합성 anomaly fixture 변동성 보완
요일 변화와 완만한 감소를 포함한 21개 세션 fixture 추가

일정한 baseline이 시각 예시로 보이던 문제 해소

사용자·임상 자료 및 성능 평가가 아닌 합성 replay 범위 유지
</commit_message>
<xml_diff>
--- a/output/poster-handoff-final/Reminiscence_포스터_본문_최종본.docx
+++ b/output/poster-handoff-final/Reminiscence_포스터_본문_최종본.docx
@@ -795,7 +795,7 @@
           <w:u w:val="none"/>
           <w:lang w:val="ko-KR" w:eastAsia="ko-KR"/>
         </w:rPr>
-        <w:t>대화 이상 평가의 재현 예시는 저장소의 합성 test fixture를 사용했다. 20개 기준 세션은 매회 사용자 턴 5회, 총 100자, 평균 20자, 평균 입력 시간 8초, 무응답 0회로 구성하고, 21번째 세션은 사용자 턴 0회, 글자 수 0자, 무응답 5회로 구성했다. 구현은 21번째 세션을 ANOMALOUS로 판정했다. 이 예시는 알고리즘 경계와 결정성을 확인하기 위한 합성 입력이며 사용자 또는 임상 데이터가 아니다.</w:t>
+        <w:t>대화 이상 평가의 재현 예시는 handoff용 합성 fixture를 사용했다. 20개 기준 세션은 요일 변화와 완만한 감소를 포함하며 사용자 턴 3–7회, 총 53–158자, 평균 입력 시간 6.7–9.4초, 무응답 0–1회 범위로 구성했다. 21번째 세션은 사용자 턴 2회, 총 31자, 평균 입력 시간 5.4초, 무응답 2회로 구성했다. 구현은 21번째 세션을 ANOMALOUS로 판정했다. 이 예시는 알고리즘 경계와 결정성을 확인하기 위한 합성 입력이며 사용자 또는 임상 데이터가 아니다.</w:t>
       </w:r>
     </w:p>
     <w:p>
@@ -1259,7 +1259,7 @@
           <w:u w:val="none"/>
           <w:lang w:val="ko-KR" w:eastAsia="ko-KR"/>
         </w:rPr>
-        <w:t>Figure 4는 tests/anomaly/test_detector.py의 합성 fixture를 같은 feature 계산으로 재현한 것이다. 첫 20세션은 사용자 턴 5회, 총 100자, 평균 20자, 평균 입력 시간 8초와 무응답 0회를 사용한다. 21번째 세션은 사용자 턴과 글자 수가 0이고 무응답이 5회이다. 최근 7일 사용자 턴 수는 창이 채워지는 동안 증가해 기준 세션에서 35회에 도달한다. 현재 세션 값은 30회다.</w:t>
+        <w:t>Figure 4는 요일 변화와 완만한 감소를 포함한 handoff 합성 fixture를 현재 구현과 같은 feature 계산으로 재현한 것이다. 첫 20세션의 사용자 턴은 3–7회, 총 글자 수는 53–158자, 무응답은 0–1회 사이에서 변한다. 최근 7일 사용자 턴 수는 창이 채워진 뒤 38회에서 31회까지 변화한다. 21번째 현재 세션은 사용자 턴 2회, 총 31자, 무응답 2회이며 최근 7일 사용자 턴 수는 29회다.</w:t>
       </w:r>
     </w:p>
     <w:p>
@@ -1293,7 +1293,7 @@
           <w:u w:val="none"/>
           <w:lang w:val="ko-KR" w:eastAsia="ko-KR"/>
         </w:rPr>
-        <w:t>재현된 decision function 값은 -0.001109이다. 이 값은 확률이 아니므로 Figure 4에서는 위험도나 백분율로 변환하지 않았다. 공개 상태와 이메일은 동일 후보가 기본 세 번의 연속 평가에서 유지될 때 확정된다.</w:t>
+        <w:t>재현된 decision function 값은 -0.048242이다. 이 값은 확률이 아니므로 Figure 4에서는 위험도나 백분율로 변환하지 않았다. 공개 상태와 이메일은 동일 후보가 기본 세 번의 연속 평가에서 유지될 때 확정된다.</w:t>
       </w:r>
     </w:p>
     <w:p>
@@ -1351,7 +1351,7 @@
           <w:u w:val="none"/>
           <w:lang w:val="ko-KR" w:eastAsia="ko-KR"/>
         </w:rPr>
-        <w:t>Figure 4. 20개 기준 세션과 1개 현재 세션으로 구성한 합성 test fixture. 사용자 및 임상 데이터가 아니며 분류 성능을 나타내지 않는다.</w:t>
+        <w:t>Figure 4. 요일 변화와 완만한 감소를 포함한 20개 기준 세션과 1개 현재 세션의 합성 fixture. 사용자 및 임상 데이터가 아니며 분류 성능을 나타내지 않는다.</w:t>
       </w:r>
     </w:p>
     <w:p>
@@ -4022,7 +4022,7 @@
                 <w:u w:val="none"/>
                 <w:lang w:val="ko-KR" w:eastAsia="ko-KR"/>
               </w:rPr>
-              <w:t>ANOMALOUS, score -0.001109</w:t>
+              <w:t>ANOMALOUS, score -0.048242</w:t>
             </w:r>
           </w:p>
         </w:tc>
@@ -4061,7 +4061,7 @@
                 <w:u w:val="none"/>
                 <w:lang w:val="ko-KR" w:eastAsia="ko-KR"/>
               </w:rPr>
-              <w:t>결정적 동작 예시이며 성능 평가가 아님</w:t>
+              <w:t>변동을 포함한 결정적 동작 예시이며 성능 평가가 아님</w:t>
             </w:r>
           </w:p>
         </w:tc>
@@ -4333,7 +4333,7 @@
           <w:u w:val="none"/>
           <w:lang w:val="ko-KR" w:eastAsia="ko-KR"/>
         </w:rPr>
-        <w:t>20개 기준 세션과 21번째 현재 세션을 사용한 합성 이상 탐지 동작 예시. 현재 세션은 사용자 턴 0회, 총 글자 수 0자, 무응답 5회이며 domain detector는 ANOMALOUS를 반환한다. 이 fixture는 사용자·임상 자료와 모델 성능 평가가 아니다.</w:t>
+        <w:t>요일 변화와 완만한 감소를 포함한 20개 기준 세션과 21번째 현재 세션의 합성 이상 탐지 동작 예시. 현재 세션은 사용자 턴 2회, 총 글자 수 31자, 무응답 2회이며 domain detector는 ANOMALOUS를 반환한다. 이 fixture는 사용자·임상 자료와 모델 성능 평가가 아니다.</w:t>
       </w:r>
     </w:p>
     <w:p>

</xml_diff>

<commit_message>
docs(poster): 음성 전사 표기를 OpenAI API로 정리
포스터 원고, Figure, 표와 handoff 문서의 codex-lb 표기를 OpenAI API로 통일

서버 측 데이터 처리는 운영 시 별도 확인 필요
</commit_message>
<xml_diff>
--- a/output/poster-handoff-final/Reminiscence_포스터_본문_최종본.docx
+++ b/output/poster-handoff-final/Reminiscence_포스터_본문_최종본.docx
@@ -449,7 +449,7 @@
           <w:u w:val="none"/>
           <w:lang w:val="ko-KR" w:eastAsia="ko-KR"/>
         </w:rPr>
-        <w:t>회상 대화의 WAV는 Raspberry Pi 메모리에서 16 kHz mono PCM 16-bit로 정규화된다. 정규화한 음성은 codex-lb의 OpenAI 호환 POST /v1/audio/transcriptions로 전송되며 요청 모델 식별자는 gpt-4o-transcribe로 고정된다. 반환된 text는 대화 지표로 축약되고 로컬 파일에 보존되지 않는다. codex-lb와 그 하위 전사 제공자의 보존 정책은 Reminiscence 저장소 밖의 운영 경계에 속한다.</w:t>
+        <w:t>회상 대화의 WAV는 Raspberry Pi 메모리에서 16 kHz mono PCM 16-bit로 정규화된다. 정규화한 음성은 OpenAI API의 POST /v1/audio/transcriptions로 전송되며 모델 식별자는 gpt-4o-transcribe이다. 반환된 text는 대화 지표로 축약되고 로컬 파일에 보존되지 않는다. OpenAI API의 서버 측 데이터 처리는 운영 시 별도로 확인한다.</w:t>
       </w:r>
     </w:p>
     <w:p>
@@ -778,7 +778,7 @@
           <w:u w:val="none"/>
           <w:lang w:val="ko-KR" w:eastAsia="ko-KR"/>
         </w:rPr>
-        <w:t>현재 저장소의 자동 검증은 pytest 274건 통과와 선택형 Supertonic 실모델 smoke test 1건 제외, Ruff 정적 검사 통과, mypy 44개 source files 오류 없음으로 확인되었다. 외부 codex-lb, 실제 Supertonic model weights와 SMTP 연결은 기본 테스트에서 test double로 대체되므로 이 결과는 외부 서비스 성능을 의미하지 않는다.</w:t>
+        <w:t>현재 저장소의 자동 검증은 pytest 274건 통과와 선택형 Supertonic 실모델 smoke test 1건 제외, Ruff 정적 검사 통과, mypy 44개 source files 오류 없음으로 확인되었다. 외부 OpenAI API, 실제 Supertonic model weights와 SMTP 연결은 기본 테스트에서 test double로 대체되므로 이 결과는 외부 서비스 성능을 의미하지 않는다.</w:t>
       </w:r>
     </w:p>
     <w:p>
@@ -869,7 +869,7 @@
           <w:u w:val="none"/>
           <w:lang w:val="ko-KR" w:eastAsia="ko-KR"/>
         </w:rPr>
-        <w:t>현재 구현에는 실제 고령 사용자 연구, 임상 결과, 한국어 전사 WER·CER, 실제 Raspberry Pi 음성 처리 지연과 Supertonic 3 합성 지연·RTF·메모리 측정, 이상 탐지 precision·recall·false alarm rate가 없다. 회상 질문은 고정형 문구이며 사진의 의미 정보를 이용한 개인화 질문 생성은 포함하지 않는다. 음성은 codex-lb로 전송되므로 완전한 장치 내 음성 처리로 표현할 수 없다. 보호자 이메일은 이상 에피소드당 한 번만 시도하며 실패 재시도, 수신 확인과 과거 알림 이력을 제공하지 않는다.</w:t>
+        <w:t>현재 구현에는 실제 고령 사용자 연구, 임상 결과, 한국어 전사 WER·CER, 실제 Raspberry Pi 음성 처리 지연과 Supertonic 3 합성 지연·RTF·메모리 측정, 이상 탐지 precision·recall·false alarm rate가 없다. 회상 질문은 고정형 문구이며 사진의 의미 정보를 이용한 개인화 질문 생성은 포함하지 않는다. 음성은 OpenAI API로 전송되므로 완전한 장치 내 음성 처리로 표현할 수 없다. 보호자 이메일은 이상 에피소드당 한 번만 시도하며 실패 재시도, 수신 확인과 과거 알림 이력을 제공하지 않는다.</w:t>
       </w:r>
     </w:p>
     <w:p>
@@ -906,7 +906,7 @@
           <w:u w:val="none"/>
           <w:lang w:val="ko-KR" w:eastAsia="ko-KR"/>
         </w:rPr>
-        <w:t>Reminiscence는 사진 액자형 인터페이스, 결정적 루틴 상태 머신, codex-lb 기반 gpt-4o-transcribe 전사, Raspberry Pi의 Supertonic 3 로컬 음성 출력, 최소 지표 저장, 개인 이력 기반 이상 평가와 보호자 이메일을 하나의 프로토타입으로 통합했다. 구현 검증의 범위는 시스템 동작과 데이터 계약이며, 이 결과는 후속 사용성·성능·장기 관찰 연구를 수행할 수 있는 재현 가능한 기반을 제공한다.</w:t>
+        <w:t>Reminiscence는 사진 액자형 인터페이스, 결정적 루틴 상태 머신, OpenAI API 기반 gpt-4o-transcribe 전사, Raspberry Pi의 Supertonic 3 로컬 음성 출력, 최소 지표 저장, 개인 이력 기반 이상 평가와 보호자 이메일을 하나의 프로토타입으로 통합했다. 구현 검증의 범위는 시스템 동작과 데이터 계약이며, 이 결과는 후속 사용성·성능·장기 관찰 연구를 수행할 수 있는 재현 가능한 기반을 제공한다.</w:t>
       </w:r>
     </w:p>
     <w:p>
@@ -985,7 +985,7 @@
           <w:u w:val="none"/>
           <w:lang w:val="ko-KR" w:eastAsia="ko-KR"/>
         </w:rPr>
-        <w:t>codex-lb 요청은 OpenAI 호환 /v1/audio/transcriptions에 multipart 형식으로 전송한다. 필드는 speech.wav 파일, gpt-4o-transcribe 모델 식별자와 한국어 회상 대화를 알리는 고정 prompt로 제한하며 Bearer proxy key를 사용한다. 기본 timeout은 연결 10초와 응답 150초이고 redirect와 retry를 사용하지 않는다.</w:t>
+        <w:t>OpenAI API 요청은 /v1/audio/transcriptions에 multipart 형식으로 전송한다. 필드는 speech.wav 파일, gpt-4o-transcribe 모델 식별자와 한국어 회상 대화를 알리는 고정 prompt로 제한한다. 기본 timeout은 연결 10초와 응답 150초이며 redirect와 retry를 사용하지 않는다.</w:t>
       </w:r>
     </w:p>
     <w:p>
@@ -1589,7 +1589,7 @@
                 <w:u w:val="none"/>
                 <w:lang w:val="ko-KR" w:eastAsia="ko-KR"/>
               </w:rPr>
-              <w:t>태블릿, Raspberry Pi 메모리, codex-lb</w:t>
+              <w:t>태블릿, Raspberry Pi 메모리, OpenAI API</w:t>
             </w:r>
           </w:p>
         </w:tc>
@@ -1670,7 +1670,7 @@
                 <w:u w:val="none"/>
                 <w:lang w:val="ko-KR" w:eastAsia="ko-KR"/>
               </w:rPr>
-              <w:t>전사 text와 provider 응답</w:t>
+              <w:t>전사 text와 API 응답</w:t>
             </w:r>
           </w:p>
         </w:tc>
@@ -1709,7 +1709,7 @@
                 <w:u w:val="none"/>
                 <w:lang w:val="ko-KR" w:eastAsia="ko-KR"/>
               </w:rPr>
-              <w:t>codex-lb에서 Raspberry Pi 메모리</w:t>
+              <w:t>OpenAI API에서 Raspberry Pi 메모리</w:t>
             </w:r>
           </w:p>
         </w:tc>
@@ -2613,7 +2613,7 @@
           <w:u w:val="none"/>
           <w:lang w:val="ko-KR" w:eastAsia="ko-KR"/>
         </w:rPr>
-        <w:t>codex-lb와 하위 전사 provider의 서버 측 보존 여부는 이 저장소의 로컬 비보존 정책으로 확인할 수 없으며 운영 시 별도로 검토해야 한다.</w:t>
+        <w:t>OpenAI API의 서버 측 데이터 처리는 이 저장소의 로컬 비보존 정책과 별도로 확인해야 한다.</w:t>
       </w:r>
     </w:p>
     <w:p>
@@ -2972,7 +2972,7 @@
                 <w:u w:val="none"/>
                 <w:lang w:val="ko-KR" w:eastAsia="ko-KR"/>
               </w:rPr>
-              <w:t>codex-lb OpenAI 호환 API, gpt-4o-transcribe</w:t>
+              <w:t>OpenAI API, gpt-4o-transcribe</w:t>
             </w:r>
           </w:p>
         </w:tc>
@@ -4086,7 +4086,7 @@
           <w:u w:val="none"/>
           <w:lang w:val="ko-KR" w:eastAsia="ko-KR"/>
         </w:rPr>
-        <w:t>제외된 한 건은 실제 Supertonic 3 model weights를 요구하는 선택형 smoke test이다. 외부 codex-lb live test, 한국어 WER·CER, 실제 SMTP 도달, 사용자 연구와 임상 평가는 이 결과에 포함되지 않는다.</w:t>
+        <w:t>제외된 한 건은 실제 Supertonic 3 model weights를 요구하는 선택형 smoke test이다. 외부 OpenAI API live test, 한국어 WER·CER, 실제 SMTP 도달, 사용자 연구와 임상 평가는 이 결과에 포함되지 않는다.</w:t>
       </w:r>
     </w:p>
     <w:p>

</xml_diff>

<commit_message>
docs(poster): Figure 흐름과 설명 밀도 정리
고정 크기 화살촉, 색상별 marker, 명확한 분기선과 간결한 Figure 라벨 적용

DOCX, PDF와 handoff 압축파일 재생성 및 전체 페이지 검수
</commit_message>
<xml_diff>
--- a/output/poster-handoff-final/Reminiscence_포스터_본문_최종본.docx
+++ b/output/poster-handoff-final/Reminiscence_포스터_본문_최종본.docx
@@ -524,7 +524,7 @@
           <w:u w:val="none"/>
           <w:lang w:val="ko-KR" w:eastAsia="ko-KR"/>
         </w:rPr>
-        <w:t>Figure 1. 태블릿, Raspberry Pi와 설정 가능한 네트워크 서비스 사이의 데이터 흐름. 점선은 메모리와 네트워크에서 일시 처리되는 WAV·text를, 실선은 축약 지표의 로컬 저장을 뜻한다.</w:t>
+        <w:t>Figure 1. 태블릿, Raspberry Pi, OpenAI API와 SMTP의 데이터 경계. WAV와 전사 text는 일시 처리되고 축약 지표만 로컬 JSON에 저장된다.</w:t>
       </w:r>
     </w:p>
     <w:p>
@@ -653,7 +653,7 @@
           <w:u w:val="none"/>
           <w:lang w:val="ko-KR" w:eastAsia="ko-KR"/>
         </w:rPr>
-        <w:t>Figure 2. 가족사진 기본 화면에서 시작해 루틴 기록 또는 회상 대화를 거쳐 다시 기본 화면으로 돌아오는 사용자 흐름과, 누적 변화가 확정된 경우에만 분기되는 보호자 확인 흐름.</w:t>
+        <w:t>Figure 2. 사진 화면에서 루틴 또는 회상 대화를 수행하고 복귀하는 흐름. 보호자 이메일은 이상 후보가 세 번 연속 확인된 경우 시도한다.</w:t>
       </w:r>
     </w:p>
     <w:p>
@@ -1168,7 +1168,7 @@
           <w:u w:val="none"/>
           <w:lang w:val="ko-KR" w:eastAsia="ko-KR"/>
         </w:rPr>
-        <w:t>Figure 3. 시연 설정의 루틴 타임라인. 사용자가 응답 가능 구간에서 기록 버튼을 누르면 이후 재알림이 중단되고 CONFIRMED로 종료된다.</w:t>
+        <w:t>Figure 3. 09:00–09:40 시연 타임라인. 구간 내 버튼 입력은 CONFIRMED, 기한 도달은 NOT_ANSWERED로 종료된다.</w:t>
       </w:r>
     </w:p>
     <w:p>
@@ -1259,41 +1259,7 @@
           <w:u w:val="none"/>
           <w:lang w:val="ko-KR" w:eastAsia="ko-KR"/>
         </w:rPr>
-        <w:t>Figure 4는 요일 변화와 완만한 감소를 포함한 handoff 합성 fixture를 현재 구현과 같은 feature 계산으로 재현한 것이다. 첫 20세션의 사용자 턴은 3–7회, 총 글자 수는 53–158자, 무응답은 0–1회 사이에서 변한다. 최근 7일 사용자 턴 수는 창이 채워진 뒤 38회에서 31회까지 변화한다. 21번째 현재 세션은 사용자 턴 2회, 총 31자, 무응답 2회이며 최근 7일 사용자 턴 수는 29회다.</w:t>
-      </w:r>
-    </w:p>
-    <w:p>
-      <w:pPr>
-        <w:widowControl/>
-      </w:pPr>
-      <w:r>
-        <w:rPr>
-          <w:rFonts w:ascii="AppleGothic" w:hAnsi="AppleGothic" w:eastAsia="AppleGothic" w:cs="AppleGothic" w:hint="eastAsia"/>
-          <w:b w:val="0"/>
-          <w:i w:val="0"/>
-          <w:color w:val="1F2933"/>
-          <w:sz w:val="22"/>
-          <w:u w:val="none"/>
-          <w:lang w:val="ko-KR" w:eastAsia="ko-KR"/>
-        </w:rPr>
-        <w:t>Domain detector는 현재 세션을 ANOMALOUS로 판정했다.</w:t>
-      </w:r>
-    </w:p>
-    <w:p>
-      <w:pPr>
-        <w:widowControl/>
-      </w:pPr>
-      <w:r>
-        <w:rPr>
-          <w:rFonts w:ascii="AppleGothic" w:hAnsi="AppleGothic" w:eastAsia="AppleGothic" w:cs="AppleGothic" w:hint="eastAsia"/>
-          <w:b w:val="0"/>
-          <w:i w:val="0"/>
-          <w:color w:val="1F2933"/>
-          <w:sz w:val="22"/>
-          <w:u w:val="none"/>
-          <w:lang w:val="ko-KR" w:eastAsia="ko-KR"/>
-        </w:rPr>
-        <w:t>재현된 decision function 값은 -0.048242이다. 이 값은 확률이 아니므로 Figure 4에서는 위험도나 백분율로 변환하지 않았다. 공개 상태와 이메일은 동일 후보가 기본 세 번의 연속 평가에서 유지될 때 확정된다.</w:t>
+        <w:t>Figure 4는 20개 기준 세션과 21번째 현재 세션을 구현과 같은 feature 계산에 입력한 합성 재현이다. 현재 세션은 최근 7일 사용자 턴 29회, 총 31자, 무응답 2회로 구성했으며 domain detector는 ANOMALOUS, decision function -0.048242를 반환했다. 이 값은 확률이 아니며 동일 후보가 세 번 연속 확인된 뒤 공개 상태와 이메일을 확정한다.</w:t>
       </w:r>
     </w:p>
     <w:p>
@@ -1351,7 +1317,7 @@
           <w:u w:val="none"/>
           <w:lang w:val="ko-KR" w:eastAsia="ko-KR"/>
         </w:rPr>
-        <w:t>Figure 4. 요일 변화와 완만한 감소를 포함한 20개 기준 세션과 1개 현재 세션의 합성 fixture. 사용자 및 임상 데이터가 아니며 분류 성능을 나타내지 않는다.</w:t>
+        <w:t>Figure 4. 20개 기준 세션과 1개 현재 세션의 합성 동작 재현. 사용자·임상 자료와 분류 성능 평가가 아니다.</w:t>
       </w:r>
     </w:p>
     <w:p>
@@ -4222,7 +4188,7 @@
           <w:u w:val="none"/>
           <w:lang w:val="ko-KR" w:eastAsia="ko-KR"/>
         </w:rPr>
-        <w:t>Reminiscence의 시스템과 데이터 경계. 태블릿은 화면, 마이크와 스피커를 담당하고 Raspberry Pi는 상태 전이, 안전한 고정형 질문, 지표 축약, Supertonic 3 합성, 로컬 저장과 이상 평가를 담당한다. WAV와 전사 text는 일시 처리되며 축약된 대화·루틴 지표만 로컬 JSON에 저장된다.</w:t>
+        <w:t>태블릿, Raspberry Pi, OpenAI API와 SMTP의 데이터 경계. WAV와 전사 text는 일시 처리되고 축약된 대화·루틴 지표만 로컬 JSON에 저장된다.</w:t>
       </w:r>
     </w:p>
     <w:p>
@@ -4259,7 +4225,7 @@
           <w:u w:val="none"/>
           <w:lang w:val="ko-KR" w:eastAsia="ko-KR"/>
         </w:rPr>
-        <w:t>가족사진 기본 화면을 중심으로 한 사용자 시나리오. 루틴 흐름은 버튼 입력에 따라 CONFIRMED 또는 NOT_ANSWERED로 종료되고, 회상 대화 흐름은 선택형 질문과 응답 지표를 기록한 뒤 기본 화면으로 돌아간다. 보호자 이메일은 누적된 이상 후보가 세 번의 연속 평가에서 유지된 경우에만 시도한다.</w:t>
+        <w:t>가족사진 화면에서 루틴 또는 회상 대화를 수행하고 복귀하는 사용자 흐름. 보호자 이메일은 이상 후보가 세 번 연속 확인된 경우 시도한다.</w:t>
       </w:r>
     </w:p>
     <w:p>
@@ -4296,7 +4262,7 @@
           <w:u w:val="none"/>
           <w:lang w:val="ko-KR" w:eastAsia="ko-KR"/>
         </w:rPr>
-        <w:t>09:00 예정, 10분 유예, 10분 간격, 최대 재알림 3회의 시연 설정. 최초 안내 뒤 09:10, 09:20, 09:30에 재알림하며 09:40부터 NOT_ANSWERED로 마감한다. 확인 가능 구간에서 버튼을 누르면 이후 재알림을 중단한다.</w:t>
+        <w:t>09:00 시작, 10분 간격, 재알림 3회의 시연 설정. 구간 내 버튼 입력은 CONFIRMED, 09:40 도달은 NOT_ANSWERED로 종료된다.</w:t>
       </w:r>
     </w:p>
     <w:p>
@@ -4333,7 +4299,7 @@
           <w:u w:val="none"/>
           <w:lang w:val="ko-KR" w:eastAsia="ko-KR"/>
         </w:rPr>
-        <w:t>요일 변화와 완만한 감소를 포함한 20개 기준 세션과 21번째 현재 세션의 합성 이상 탐지 동작 예시. 현재 세션은 사용자 턴 2회, 총 글자 수 31자, 무응답 2회이며 domain detector는 ANOMALOUS를 반환한다. 이 fixture는 사용자·임상 자료와 모델 성능 평가가 아니다.</w:t>
+        <w:t>20개 기준 세션과 21번째 현재 세션의 합성 이상 탐지 동작 예시. 현재 세션은 ANOMALOUS로 판정됐으며 사용자·임상 자료와 성능 평가가 아니다.</w:t>
       </w:r>
     </w:p>
     <w:p>

</xml_diff>